<commit_message>
Add KPIs & Metrics and Explore Tablets pages and update README implementation
</commit_message>
<xml_diff>
--- a/Hospital Pharmacy Dashboard6 Report.docx
+++ b/Hospital Pharmacy Dashboard6 Report.docx
@@ -61,7 +61,15 @@
           <w:sz w:val="36"/>
           <w:szCs w:val="36"/>
         </w:rPr>
-        <w:t xml:space="preserve"> July 2026</w:t>
+        <w:t xml:space="preserve"> July 26</w:t>
+      </w:r>
+      <w:r>
+        <w:rPr>
+          <w:rFonts w:asciiTheme="minorBidi" w:hAnsiTheme="minorBidi"/>
+          <w:sz w:val="36"/>
+          <w:szCs w:val="36"/>
+        </w:rPr>
+        <w:t xml:space="preserve"> – August 20, 2026</w:t>
       </w:r>
     </w:p>
     <w:p>
@@ -262,7 +270,7 @@
             </w:rPr>
             <w:fldChar w:fldCharType="separate"/>
           </w:r>
-          <w:hyperlink w:anchor="_Toc235283858" w:history="1">
+          <w:hyperlink w:anchor="_Toc236995792" w:history="1">
             <w:r>
               <w:rPr>
                 <w:rStyle w:val="Hyperlink"/>
@@ -291,7 +299,7 @@
                 <w:noProof/>
                 <w:webHidden/>
               </w:rPr>
-              <w:instrText xml:space="preserve"> PAGEREF _Toc235283858 \h </w:instrText>
+              <w:instrText xml:space="preserve"> PAGEREF _Toc236995792 \h </w:instrText>
             </w:r>
             <w:r>
               <w:rPr>
@@ -333,7 +341,7 @@
               <w:noProof/>
             </w:rPr>
           </w:pPr>
-          <w:hyperlink w:anchor="_Toc235283859" w:history="1">
+          <w:hyperlink w:anchor="_Toc236995793" w:history="1">
             <w:r>
               <w:rPr>
                 <w:rStyle w:val="Hyperlink"/>
@@ -362,7 +370,7 @@
                 <w:noProof/>
                 <w:webHidden/>
               </w:rPr>
-              <w:instrText xml:space="preserve"> PAGEREF _Toc235283859 \h </w:instrText>
+              <w:instrText xml:space="preserve"> PAGEREF _Toc236995793 \h </w:instrText>
             </w:r>
             <w:r>
               <w:rPr>
@@ -404,7 +412,7 @@
               <w:noProof/>
             </w:rPr>
           </w:pPr>
-          <w:hyperlink w:anchor="_Toc235283860" w:history="1">
+          <w:hyperlink w:anchor="_Toc236995794" w:history="1">
             <w:r>
               <w:rPr>
                 <w:rStyle w:val="Hyperlink"/>
@@ -433,7 +441,7 @@
                 <w:noProof/>
                 <w:webHidden/>
               </w:rPr>
-              <w:instrText xml:space="preserve"> PAGEREF _Toc235283860 \h </w:instrText>
+              <w:instrText xml:space="preserve"> PAGEREF _Toc236995794 \h </w:instrText>
             </w:r>
             <w:r>
               <w:rPr>
@@ -475,7 +483,7 @@
               <w:noProof/>
             </w:rPr>
           </w:pPr>
-          <w:hyperlink w:anchor="_Toc235283861" w:history="1">
+          <w:hyperlink w:anchor="_Toc236995795" w:history="1">
             <w:r>
               <w:rPr>
                 <w:rStyle w:val="Hyperlink"/>
@@ -504,7 +512,7 @@
                 <w:noProof/>
                 <w:webHidden/>
               </w:rPr>
-              <w:instrText xml:space="preserve"> PAGEREF _Toc235283861 \h </w:instrText>
+              <w:instrText xml:space="preserve"> PAGEREF _Toc236995795 \h </w:instrText>
             </w:r>
             <w:r>
               <w:rPr>
@@ -546,7 +554,7 @@
               <w:noProof/>
             </w:rPr>
           </w:pPr>
-          <w:hyperlink w:anchor="_Toc235283862" w:history="1">
+          <w:hyperlink w:anchor="_Toc236995796" w:history="1">
             <w:r>
               <w:rPr>
                 <w:rStyle w:val="Hyperlink"/>
@@ -575,7 +583,7 @@
                 <w:noProof/>
                 <w:webHidden/>
               </w:rPr>
-              <w:instrText xml:space="preserve"> PAGEREF _Toc235283862 \h </w:instrText>
+              <w:instrText xml:space="preserve"> PAGEREF _Toc236995796 \h </w:instrText>
             </w:r>
             <w:r>
               <w:rPr>
@@ -617,7 +625,7 @@
               <w:noProof/>
             </w:rPr>
           </w:pPr>
-          <w:hyperlink w:anchor="_Toc235283863" w:history="1">
+          <w:hyperlink w:anchor="_Toc236995797" w:history="1">
             <w:r>
               <w:rPr>
                 <w:rStyle w:val="Hyperlink"/>
@@ -646,7 +654,7 @@
                 <w:noProof/>
                 <w:webHidden/>
               </w:rPr>
-              <w:instrText xml:space="preserve"> PAGEREF _Toc235283863 \h </w:instrText>
+              <w:instrText xml:space="preserve"> PAGEREF _Toc236995797 \h </w:instrText>
             </w:r>
             <w:r>
               <w:rPr>
@@ -688,7 +696,7 @@
               <w:noProof/>
             </w:rPr>
           </w:pPr>
-          <w:hyperlink w:anchor="_Toc235283864" w:history="1">
+          <w:hyperlink w:anchor="_Toc236995798" w:history="1">
             <w:r>
               <w:rPr>
                 <w:rStyle w:val="Hyperlink"/>
@@ -717,7 +725,7 @@
                 <w:noProof/>
                 <w:webHidden/>
               </w:rPr>
-              <w:instrText xml:space="preserve"> PAGEREF _Toc235283864 \h </w:instrText>
+              <w:instrText xml:space="preserve"> PAGEREF _Toc236995798 \h </w:instrText>
             </w:r>
             <w:r>
               <w:rPr>
@@ -759,7 +767,7 @@
               <w:noProof/>
             </w:rPr>
           </w:pPr>
-          <w:hyperlink w:anchor="_Toc235283865" w:history="1">
+          <w:hyperlink w:anchor="_Toc236995799" w:history="1">
             <w:r>
               <w:rPr>
                 <w:rStyle w:val="Hyperlink"/>
@@ -788,7 +796,7 @@
                 <w:noProof/>
                 <w:webHidden/>
               </w:rPr>
-              <w:instrText xml:space="preserve"> PAGEREF _Toc235283865 \h </w:instrText>
+              <w:instrText xml:space="preserve"> PAGEREF _Toc236995799 \h </w:instrText>
             </w:r>
             <w:r>
               <w:rPr>
@@ -830,7 +838,7 @@
               <w:noProof/>
             </w:rPr>
           </w:pPr>
-          <w:hyperlink w:anchor="_Toc235283866" w:history="1">
+          <w:hyperlink w:anchor="_Toc236995800" w:history="1">
             <w:r>
               <w:rPr>
                 <w:rStyle w:val="Hyperlink"/>
@@ -859,7 +867,7 @@
                 <w:noProof/>
                 <w:webHidden/>
               </w:rPr>
-              <w:instrText xml:space="preserve"> PAGEREF _Toc235283866 \h </w:instrText>
+              <w:instrText xml:space="preserve"> PAGEREF _Toc236995800 \h </w:instrText>
             </w:r>
             <w:r>
               <w:rPr>
@@ -901,7 +909,7 @@
               <w:noProof/>
             </w:rPr>
           </w:pPr>
-          <w:hyperlink w:anchor="_Toc235283867" w:history="1">
+          <w:hyperlink w:anchor="_Toc236995801" w:history="1">
             <w:r>
               <w:rPr>
                 <w:rStyle w:val="Hyperlink"/>
@@ -930,7 +938,7 @@
                 <w:noProof/>
                 <w:webHidden/>
               </w:rPr>
-              <w:instrText xml:space="preserve"> PAGEREF _Toc235283867 \h </w:instrText>
+              <w:instrText xml:space="preserve"> PAGEREF _Toc236995801 \h </w:instrText>
             </w:r>
             <w:r>
               <w:rPr>
@@ -972,7 +980,7 @@
               <w:noProof/>
             </w:rPr>
           </w:pPr>
-          <w:hyperlink w:anchor="_Toc235283868" w:history="1">
+          <w:hyperlink w:anchor="_Toc236995802" w:history="1">
             <w:r>
               <w:rPr>
                 <w:rStyle w:val="Hyperlink"/>
@@ -1001,7 +1009,7 @@
                 <w:noProof/>
                 <w:webHidden/>
               </w:rPr>
-              <w:instrText xml:space="preserve"> PAGEREF _Toc235283868 \h </w:instrText>
+              <w:instrText xml:space="preserve"> PAGEREF _Toc236995802 \h </w:instrText>
             </w:r>
             <w:r>
               <w:rPr>
@@ -1043,7 +1051,7 @@
               <w:noProof/>
             </w:rPr>
           </w:pPr>
-          <w:hyperlink w:anchor="_Toc235283869" w:history="1">
+          <w:hyperlink w:anchor="_Toc236995803" w:history="1">
             <w:r>
               <w:rPr>
                 <w:rStyle w:val="Hyperlink"/>
@@ -1072,7 +1080,7 @@
                 <w:noProof/>
                 <w:webHidden/>
               </w:rPr>
-              <w:instrText xml:space="preserve"> PAGEREF _Toc235283869 \h </w:instrText>
+              <w:instrText xml:space="preserve"> PAGEREF _Toc236995803 \h </w:instrText>
             </w:r>
             <w:r>
               <w:rPr>
@@ -1114,7 +1122,7 @@
               <w:noProof/>
             </w:rPr>
           </w:pPr>
-          <w:hyperlink w:anchor="_Toc235283870" w:history="1">
+          <w:hyperlink w:anchor="_Toc236995804" w:history="1">
             <w:r>
               <w:rPr>
                 <w:rStyle w:val="Hyperlink"/>
@@ -1143,7 +1151,7 @@
                 <w:noProof/>
                 <w:webHidden/>
               </w:rPr>
-              <w:instrText xml:space="preserve"> PAGEREF _Toc235283870 \h </w:instrText>
+              <w:instrText xml:space="preserve"> PAGEREF _Toc236995804 \h </w:instrText>
             </w:r>
             <w:r>
               <w:rPr>
@@ -1185,7 +1193,7 @@
               <w:noProof/>
             </w:rPr>
           </w:pPr>
-          <w:hyperlink w:anchor="_Toc235283871" w:history="1">
+          <w:hyperlink w:anchor="_Toc236995805" w:history="1">
             <w:r>
               <w:rPr>
                 <w:rStyle w:val="Hyperlink"/>
@@ -1214,7 +1222,7 @@
                 <w:noProof/>
                 <w:webHidden/>
               </w:rPr>
-              <w:instrText xml:space="preserve"> PAGEREF _Toc235283871 \h </w:instrText>
+              <w:instrText xml:space="preserve"> PAGEREF _Toc236995805 \h </w:instrText>
             </w:r>
             <w:r>
               <w:rPr>
@@ -1256,7 +1264,7 @@
               <w:noProof/>
             </w:rPr>
           </w:pPr>
-          <w:hyperlink w:anchor="_Toc235283872" w:history="1">
+          <w:hyperlink w:anchor="_Toc236995806" w:history="1">
             <w:r>
               <w:rPr>
                 <w:rStyle w:val="Hyperlink"/>
@@ -1285,7 +1293,7 @@
                 <w:noProof/>
                 <w:webHidden/>
               </w:rPr>
-              <w:instrText xml:space="preserve"> PAGEREF _Toc235283872 \h </w:instrText>
+              <w:instrText xml:space="preserve"> PAGEREF _Toc236995806 \h </w:instrText>
             </w:r>
             <w:r>
               <w:rPr>
@@ -1327,7 +1335,7 @@
               <w:noProof/>
             </w:rPr>
           </w:pPr>
-          <w:hyperlink w:anchor="_Toc235283873" w:history="1">
+          <w:hyperlink w:anchor="_Toc236995807" w:history="1">
             <w:r>
               <w:rPr>
                 <w:rStyle w:val="Hyperlink"/>
@@ -1356,7 +1364,7 @@
                 <w:noProof/>
                 <w:webHidden/>
               </w:rPr>
-              <w:instrText xml:space="preserve"> PAGEREF _Toc235283873 \h </w:instrText>
+              <w:instrText xml:space="preserve"> PAGEREF _Toc236995807 \h </w:instrText>
             </w:r>
             <w:r>
               <w:rPr>
@@ -1398,7 +1406,7 @@
               <w:noProof/>
             </w:rPr>
           </w:pPr>
-          <w:hyperlink w:anchor="_Toc235283874" w:history="1">
+          <w:hyperlink w:anchor="_Toc236995808" w:history="1">
             <w:r>
               <w:rPr>
                 <w:rStyle w:val="Hyperlink"/>
@@ -1427,7 +1435,7 @@
                 <w:noProof/>
                 <w:webHidden/>
               </w:rPr>
-              <w:instrText xml:space="preserve"> PAGEREF _Toc235283874 \h </w:instrText>
+              <w:instrText xml:space="preserve"> PAGEREF _Toc236995808 \h </w:instrText>
             </w:r>
             <w:r>
               <w:rPr>
@@ -1469,7 +1477,7 @@
               <w:noProof/>
             </w:rPr>
           </w:pPr>
-          <w:hyperlink w:anchor="_Toc235283875" w:history="1">
+          <w:hyperlink w:anchor="_Toc236995809" w:history="1">
             <w:r>
               <w:rPr>
                 <w:rStyle w:val="Hyperlink"/>
@@ -1498,7 +1506,7 @@
                 <w:noProof/>
                 <w:webHidden/>
               </w:rPr>
-              <w:instrText xml:space="preserve"> PAGEREF _Toc235283875 \h </w:instrText>
+              <w:instrText xml:space="preserve"> PAGEREF _Toc236995809 \h </w:instrText>
             </w:r>
             <w:r>
               <w:rPr>
@@ -1540,7 +1548,7 @@
               <w:noProof/>
             </w:rPr>
           </w:pPr>
-          <w:hyperlink w:anchor="_Toc235283876" w:history="1">
+          <w:hyperlink w:anchor="_Toc236995810" w:history="1">
             <w:r>
               <w:rPr>
                 <w:rStyle w:val="Hyperlink"/>
@@ -1569,7 +1577,7 @@
                 <w:noProof/>
                 <w:webHidden/>
               </w:rPr>
-              <w:instrText xml:space="preserve"> PAGEREF _Toc235283876 \h </w:instrText>
+              <w:instrText xml:space="preserve"> PAGEREF _Toc236995810 \h </w:instrText>
             </w:r>
             <w:r>
               <w:rPr>
@@ -1611,7 +1619,7 @@
               <w:noProof/>
             </w:rPr>
           </w:pPr>
-          <w:hyperlink w:anchor="_Toc235283877" w:history="1">
+          <w:hyperlink w:anchor="_Toc236995811" w:history="1">
             <w:r>
               <w:rPr>
                 <w:rStyle w:val="Hyperlink"/>
@@ -1640,7 +1648,7 @@
                 <w:noProof/>
                 <w:webHidden/>
               </w:rPr>
-              <w:instrText xml:space="preserve"> PAGEREF _Toc235283877 \h </w:instrText>
+              <w:instrText xml:space="preserve"> PAGEREF _Toc236995811 \h </w:instrText>
             </w:r>
             <w:r>
               <w:rPr>
@@ -1682,7 +1690,7 @@
               <w:noProof/>
             </w:rPr>
           </w:pPr>
-          <w:hyperlink w:anchor="_Toc235283878" w:history="1">
+          <w:hyperlink w:anchor="_Toc236995812" w:history="1">
             <w:r>
               <w:rPr>
                 <w:rStyle w:val="Hyperlink"/>
@@ -1711,7 +1719,7 @@
                 <w:noProof/>
                 <w:webHidden/>
               </w:rPr>
-              <w:instrText xml:space="preserve"> PAGEREF _Toc235283878 \h </w:instrText>
+              <w:instrText xml:space="preserve"> PAGEREF _Toc236995812 \h </w:instrText>
             </w:r>
             <w:r>
               <w:rPr>
@@ -1753,7 +1761,7 @@
               <w:noProof/>
             </w:rPr>
           </w:pPr>
-          <w:hyperlink w:anchor="_Toc235283879" w:history="1">
+          <w:hyperlink w:anchor="_Toc236995813" w:history="1">
             <w:r>
               <w:rPr>
                 <w:rStyle w:val="Hyperlink"/>
@@ -1761,7 +1769,7 @@
                 <w:bCs/>
                 <w:noProof/>
               </w:rPr>
-              <w:t>B. Massive Overstock (considered Wasted Capital &amp; Space)</w:t>
+              <w:t>B. Massive Overstock (considered Wasted Capital &amp; Storage Space)</w:t>
             </w:r>
             <w:r>
               <w:rPr>
@@ -1782,7 +1790,7 @@
                 <w:noProof/>
                 <w:webHidden/>
               </w:rPr>
-              <w:instrText xml:space="preserve"> PAGEREF _Toc235283879 \h </w:instrText>
+              <w:instrText xml:space="preserve"> PAGEREF _Toc236995813 \h </w:instrText>
             </w:r>
             <w:r>
               <w:rPr>
@@ -1824,7 +1832,7 @@
               <w:noProof/>
             </w:rPr>
           </w:pPr>
-          <w:hyperlink w:anchor="_Toc235283880" w:history="1">
+          <w:hyperlink w:anchor="_Toc236995814" w:history="1">
             <w:r>
               <w:rPr>
                 <w:rStyle w:val="Hyperlink"/>
@@ -1853,7 +1861,7 @@
                 <w:noProof/>
                 <w:webHidden/>
               </w:rPr>
-              <w:instrText xml:space="preserve"> PAGEREF _Toc235283880 \h </w:instrText>
+              <w:instrText xml:space="preserve"> PAGEREF _Toc236995814 \h </w:instrText>
             </w:r>
             <w:r>
               <w:rPr>
@@ -1895,7 +1903,7 @@
               <w:noProof/>
             </w:rPr>
           </w:pPr>
-          <w:hyperlink w:anchor="_Toc235283881" w:history="1">
+          <w:hyperlink w:anchor="_Toc236995815" w:history="1">
             <w:r>
               <w:rPr>
                 <w:rStyle w:val="Hyperlink"/>
@@ -1924,7 +1932,7 @@
                 <w:noProof/>
                 <w:webHidden/>
               </w:rPr>
-              <w:instrText xml:space="preserve"> PAGEREF _Toc235283881 \h </w:instrText>
+              <w:instrText xml:space="preserve"> PAGEREF _Toc236995815 \h </w:instrText>
             </w:r>
             <w:r>
               <w:rPr>
@@ -1966,7 +1974,7 @@
               <w:noProof/>
             </w:rPr>
           </w:pPr>
-          <w:hyperlink w:anchor="_Toc235283882" w:history="1">
+          <w:hyperlink w:anchor="_Toc236995816" w:history="1">
             <w:r>
               <w:rPr>
                 <w:rStyle w:val="Hyperlink"/>
@@ -1995,7 +2003,7 @@
                 <w:noProof/>
                 <w:webHidden/>
               </w:rPr>
-              <w:instrText xml:space="preserve"> PAGEREF _Toc235283882 \h </w:instrText>
+              <w:instrText xml:space="preserve"> PAGEREF _Toc236995816 \h </w:instrText>
             </w:r>
             <w:r>
               <w:rPr>
@@ -2037,7 +2045,7 @@
               <w:noProof/>
             </w:rPr>
           </w:pPr>
-          <w:hyperlink w:anchor="_Toc235283883" w:history="1">
+          <w:hyperlink w:anchor="_Toc236995817" w:history="1">
             <w:r>
               <w:rPr>
                 <w:rStyle w:val="Hyperlink"/>
@@ -2066,7 +2074,7 @@
                 <w:noProof/>
                 <w:webHidden/>
               </w:rPr>
-              <w:instrText xml:space="preserve"> PAGEREF _Toc235283883 \h </w:instrText>
+              <w:instrText xml:space="preserve"> PAGEREF _Toc236995817 \h </w:instrText>
             </w:r>
             <w:r>
               <w:rPr>
@@ -2108,7 +2116,7 @@
               <w:noProof/>
             </w:rPr>
           </w:pPr>
-          <w:hyperlink w:anchor="_Toc235283884" w:history="1">
+          <w:hyperlink w:anchor="_Toc236995818" w:history="1">
             <w:r>
               <w:rPr>
                 <w:rStyle w:val="Hyperlink"/>
@@ -2137,7 +2145,7 @@
                 <w:noProof/>
                 <w:webHidden/>
               </w:rPr>
-              <w:instrText xml:space="preserve"> PAGEREF _Toc235283884 \h </w:instrText>
+              <w:instrText xml:space="preserve"> PAGEREF _Toc236995818 \h </w:instrText>
             </w:r>
             <w:r>
               <w:rPr>
@@ -2179,7 +2187,7 @@
               <w:noProof/>
             </w:rPr>
           </w:pPr>
-          <w:hyperlink w:anchor="_Toc235283885" w:history="1">
+          <w:hyperlink w:anchor="_Toc236995819" w:history="1">
             <w:r>
               <w:rPr>
                 <w:rStyle w:val="Hyperlink"/>
@@ -2208,7 +2216,7 @@
                 <w:noProof/>
                 <w:webHidden/>
               </w:rPr>
-              <w:instrText xml:space="preserve"> PAGEREF _Toc235283885 \h </w:instrText>
+              <w:instrText xml:space="preserve"> PAGEREF _Toc236995819 \h </w:instrText>
             </w:r>
             <w:r>
               <w:rPr>
@@ -2250,7 +2258,14 @@
               <w:noProof/>
             </w:rPr>
           </w:pPr>
-          <w:hyperlink w:anchor="_Toc235283886" w:history="1">
+          <w:hyperlink w:anchor="_Toc236995820" w:history="1">
+            <w:r>
+              <w:rPr>
+                <w:rStyle w:val="Hyperlink"/>
+                <w:noProof/>
+              </w:rPr>
+              <w:t xml:space="preserve">Screens </w:t>
+            </w:r>
             <w:r>
               <w:rPr>
                 <w:rStyle w:val="Hyperlink"/>
@@ -2258,7 +2273,14 @@
                 <w:bCs/>
                 <w:noProof/>
               </w:rPr>
-              <w:t>Conclusion</w:t>
+              <w:t>After</w:t>
+            </w:r>
+            <w:r>
+              <w:rPr>
+                <w:rStyle w:val="Hyperlink"/>
+                <w:noProof/>
+              </w:rPr>
+              <w:t xml:space="preserve"> Implementation</w:t>
             </w:r>
             <w:r>
               <w:rPr>
@@ -2279,7 +2301,7 @@
                 <w:noProof/>
                 <w:webHidden/>
               </w:rPr>
-              <w:instrText xml:space="preserve"> PAGEREF _Toc235283886 \h </w:instrText>
+              <w:instrText xml:space="preserve"> PAGEREF _Toc236995820 \h </w:instrText>
             </w:r>
             <w:r>
               <w:rPr>
@@ -2299,7 +2321,7 @@
                 <w:noProof/>
                 <w:webHidden/>
               </w:rPr>
-              <w:t>20</w:t>
+              <w:t>21</w:t>
             </w:r>
             <w:r>
               <w:rPr>
@@ -2321,7 +2343,7 @@
               <w:noProof/>
             </w:rPr>
           </w:pPr>
-          <w:hyperlink w:anchor="_Toc235283887" w:history="1">
+          <w:hyperlink w:anchor="_Toc236995821" w:history="1">
             <w:r>
               <w:rPr>
                 <w:rStyle w:val="Hyperlink"/>
@@ -2329,6 +2351,77 @@
                 <w:bCs/>
                 <w:noProof/>
               </w:rPr>
+              <w:t>Conclusion</w:t>
+            </w:r>
+            <w:r>
+              <w:rPr>
+                <w:noProof/>
+                <w:webHidden/>
+              </w:rPr>
+              <w:tab/>
+            </w:r>
+            <w:r>
+              <w:rPr>
+                <w:noProof/>
+                <w:webHidden/>
+              </w:rPr>
+              <w:fldChar w:fldCharType="begin"/>
+            </w:r>
+            <w:r>
+              <w:rPr>
+                <w:noProof/>
+                <w:webHidden/>
+              </w:rPr>
+              <w:instrText xml:space="preserve"> PAGEREF _Toc236995821 \h </w:instrText>
+            </w:r>
+            <w:r>
+              <w:rPr>
+                <w:noProof/>
+                <w:webHidden/>
+              </w:rPr>
+            </w:r>
+            <w:r>
+              <w:rPr>
+                <w:noProof/>
+                <w:webHidden/>
+              </w:rPr>
+              <w:fldChar w:fldCharType="separate"/>
+            </w:r>
+            <w:r>
+              <w:rPr>
+                <w:noProof/>
+                <w:webHidden/>
+              </w:rPr>
+              <w:t>27</w:t>
+            </w:r>
+            <w:r>
+              <w:rPr>
+                <w:noProof/>
+                <w:webHidden/>
+              </w:rPr>
+              <w:fldChar w:fldCharType="end"/>
+            </w:r>
+          </w:hyperlink>
+        </w:p>
+        <w:p>
+          <w:pPr>
+            <w:pStyle w:val="TOC1"/>
+            <w:tabs>
+              <w:tab w:val="right" w:leader="dot" w:pos="9350"/>
+            </w:tabs>
+            <w:rPr>
+              <w:rFonts w:cstheme="minorBidi"/>
+              <w:noProof/>
+            </w:rPr>
+          </w:pPr>
+          <w:hyperlink w:anchor="_Toc236995822" w:history="1">
+            <w:r>
+              <w:rPr>
+                <w:rStyle w:val="Hyperlink"/>
+                <w:b/>
+                <w:bCs/>
+                <w:noProof/>
+              </w:rPr>
               <w:t>Word of Author: Thank you.</w:t>
             </w:r>
             <w:r>
@@ -2350,7 +2443,7 @@
                 <w:noProof/>
                 <w:webHidden/>
               </w:rPr>
-              <w:instrText xml:space="preserve"> PAGEREF _Toc235283887 \h </w:instrText>
+              <w:instrText xml:space="preserve"> PAGEREF _Toc236995822 \h </w:instrText>
             </w:r>
             <w:r>
               <w:rPr>
@@ -2370,7 +2463,7 @@
                 <w:noProof/>
                 <w:webHidden/>
               </w:rPr>
-              <w:t>21</w:t>
+              <w:t>27</w:t>
             </w:r>
             <w:r>
               <w:rPr>
@@ -2413,13 +2506,12 @@
           <w:bCs/>
         </w:rPr>
       </w:pPr>
-      <w:bookmarkStart w:id="0" w:name="_Toc235283858"/>
+      <w:bookmarkStart w:id="0" w:name="_Toc236995792"/>
       <w:r>
         <w:rPr>
           <w:b/>
           <w:bCs/>
         </w:rPr>
-        <w:lastRenderedPageBreak/>
         <w:t>Project Objectives</w:t>
       </w:r>
       <w:bookmarkEnd w:id="0"/>
@@ -2478,7 +2570,7 @@
           <w:bCs/>
         </w:rPr>
       </w:pPr>
-      <w:bookmarkStart w:id="1" w:name="_Toc235283859"/>
+      <w:bookmarkStart w:id="1" w:name="_Toc236995793"/>
       <w:r>
         <w:rPr>
           <w:b/>
@@ -2538,7 +2630,7 @@
           <w:bCs/>
         </w:rPr>
       </w:pPr>
-      <w:bookmarkStart w:id="2" w:name="_Toc235283860"/>
+      <w:bookmarkStart w:id="2" w:name="_Toc236995794"/>
       <w:r>
         <w:rPr>
           <w:b/>
@@ -2706,7 +2798,7 @@
           <w:rtl/>
         </w:rPr>
       </w:pPr>
-      <w:bookmarkStart w:id="3" w:name="_Toc235283861"/>
+      <w:bookmarkStart w:id="3" w:name="_Toc236995795"/>
       <w:r>
         <w:rPr>
           <w:b/>
@@ -2791,7 +2883,7 @@
           <w:bCs/>
         </w:rPr>
       </w:pPr>
-      <w:bookmarkStart w:id="4" w:name="_Toc235283862"/>
+      <w:bookmarkStart w:id="4" w:name="_Toc236995796"/>
       <w:r>
         <w:rPr>
           <w:b/>
@@ -2849,7 +2941,7 @@
           <w:szCs w:val="28"/>
         </w:rPr>
       </w:pPr>
-      <w:bookmarkStart w:id="5" w:name="_Toc235283863"/>
+      <w:bookmarkStart w:id="5" w:name="_Toc236995797"/>
       <w:r>
         <w:rPr>
           <w:b/>
@@ -2939,7 +3031,7 @@
           <w:szCs w:val="28"/>
         </w:rPr>
       </w:pPr>
-      <w:bookmarkStart w:id="6" w:name="_Toc235283864"/>
+      <w:bookmarkStart w:id="6" w:name="_Toc236995798"/>
       <w:r>
         <w:rPr>
           <w:b/>
@@ -3027,17 +3119,15 @@
     </w:p>
     <w:p>
       <w:pPr>
-        <w:spacing w:after="160" w:line="259" w:lineRule="auto"/>
-        <w:rPr>
-          <w:rFonts w:asciiTheme="majorHAnsi" w:eastAsiaTheme="majorEastAsia" w:hAnsiTheme="majorHAnsi" w:cstheme="majorBidi"/>
+        <w:pStyle w:val="Heading2"/>
+        <w:rPr>
           <w:b/>
           <w:bCs/>
-          <w:color w:val="2F5496" w:themeColor="accent1" w:themeShade="BF"/>
-          <w:sz w:val="28"/>
-          <w:szCs w:val="28"/>
-        </w:rPr>
-      </w:pPr>
-      <w:bookmarkStart w:id="7" w:name="_Toc235283865"/>
+          <w:sz w:val="28"/>
+          <w:szCs w:val="28"/>
+        </w:rPr>
+      </w:pPr>
+      <w:bookmarkStart w:id="7" w:name="_Toc236995799"/>
       <w:r>
         <w:rPr>
           <w:b/>
@@ -3045,26 +3135,6 @@
           <w:sz w:val="28"/>
           <w:szCs w:val="28"/>
         </w:rPr>
-        <w:br w:type="page"/>
-      </w:r>
-    </w:p>
-    <w:p>
-      <w:pPr>
-        <w:pStyle w:val="Heading2"/>
-        <w:rPr>
-          <w:b/>
-          <w:bCs/>
-          <w:sz w:val="28"/>
-          <w:szCs w:val="28"/>
-        </w:rPr>
-      </w:pPr>
-      <w:r>
-        <w:rPr>
-          <w:b/>
-          <w:bCs/>
-          <w:sz w:val="28"/>
-          <w:szCs w:val="28"/>
-        </w:rPr>
         <w:lastRenderedPageBreak/>
         <w:t>Page 3: Search &amp; Filter</w:t>
       </w:r>
@@ -3080,17 +3150,6 @@
           <w:bdr w:val="single" w:sz="2" w:space="0" w:color="E3E3E3" w:frame="1"/>
         </w:rPr>
       </w:pPr>
-    </w:p>
-    <w:p>
-      <w:pPr>
-        <w:spacing w:after="160" w:line="259" w:lineRule="auto"/>
-        <w:rPr>
-          <w:rFonts w:asciiTheme="majorHAnsi" w:eastAsiaTheme="majorEastAsia" w:hAnsiTheme="majorHAnsi" w:cstheme="majorBidi"/>
-          <w:i/>
-          <w:iCs/>
-          <w:color w:val="2F5496" w:themeColor="accent1" w:themeShade="BF"/>
-        </w:rPr>
-      </w:pPr>
       <w:r>
         <w:rPr>
           <w:rFonts w:ascii="Arial" w:hAnsi="Arial" w:cs="Arial"/>
@@ -3099,17 +3158,9 @@
           <w:szCs w:val="28"/>
         </w:rPr>
         <w:drawing>
-          <wp:anchor distT="0" distB="0" distL="114300" distR="114300" simplePos="0" relativeHeight="251659264" behindDoc="0" locked="0" layoutInCell="1" allowOverlap="1" wp14:anchorId="28E8A96C" wp14:editId="3120E73E">
-            <wp:simplePos x="0" y="0"/>
-            <wp:positionH relativeFrom="column">
-              <wp:posOffset>-296260</wp:posOffset>
-            </wp:positionH>
-            <wp:positionV relativeFrom="paragraph">
-              <wp:posOffset>361008</wp:posOffset>
-            </wp:positionV>
+          <wp:inline distT="0" distB="0" distL="0" distR="0" wp14:anchorId="28E8A96C" wp14:editId="0A4CFFAB">
             <wp:extent cx="6486203" cy="5589182"/>
             <wp:effectExtent l="152400" t="152400" r="353060" b="354965"/>
-            <wp:wrapTopAndBottom/>
             <wp:docPr id="16" name="Picture 16"/>
             <wp:cNvGraphicFramePr>
               <a:graphicFrameLocks xmlns:a="http://schemas.openxmlformats.org/drawingml/2006/main" noChangeAspect="1"/>
@@ -3139,7 +3190,7 @@
                   <pic:spPr bwMode="auto">
                     <a:xfrm>
                       <a:off x="0" y="0"/>
-                      <a:ext cx="6486203" cy="5589182"/>
+                      <a:ext cx="6492698" cy="5594779"/>
                     </a:xfrm>
                     <a:prstGeom prst="rect">
                       <a:avLst/>
@@ -3158,9 +3209,20 @@
                 </pic:pic>
               </a:graphicData>
             </a:graphic>
-          </wp:anchor>
+          </wp:inline>
         </w:drawing>
       </w:r>
+    </w:p>
+    <w:p>
+      <w:pPr>
+        <w:spacing w:after="160" w:line="259" w:lineRule="auto"/>
+        <w:rPr>
+          <w:rFonts w:asciiTheme="majorHAnsi" w:eastAsiaTheme="majorEastAsia" w:hAnsiTheme="majorHAnsi" w:cstheme="majorBidi"/>
+          <w:i/>
+          <w:iCs/>
+          <w:color w:val="2F5496" w:themeColor="accent1" w:themeShade="BF"/>
+        </w:rPr>
+      </w:pPr>
       <w:r>
         <w:br w:type="page"/>
       </w:r>
@@ -3175,7 +3237,7 @@
           <w:szCs w:val="28"/>
         </w:rPr>
       </w:pPr>
-      <w:bookmarkStart w:id="8" w:name="_Toc235283866"/>
+      <w:bookmarkStart w:id="8" w:name="_Toc236995800"/>
       <w:r>
         <w:rPr>
           <w:rFonts w:ascii="Arial" w:hAnsi="Arial" w:cs="Arial"/>
@@ -3282,7 +3344,7 @@
           <w:szCs w:val="28"/>
         </w:rPr>
       </w:pPr>
-      <w:bookmarkStart w:id="9" w:name="_Toc235283867"/>
+      <w:bookmarkStart w:id="9" w:name="_Toc236995801"/>
       <w:r>
         <w:rPr>
           <w:b/>
@@ -3403,7 +3465,7 @@
           <w:szCs w:val="28"/>
         </w:rPr>
       </w:pPr>
-      <w:bookmarkStart w:id="10" w:name="_Toc235283868"/>
+      <w:bookmarkStart w:id="10" w:name="_Toc236995802"/>
       <w:r>
         <w:rPr>
           <w:b/>
@@ -3535,7 +3597,7 @@
           <w:szCs w:val="28"/>
         </w:rPr>
       </w:pPr>
-      <w:bookmarkStart w:id="11" w:name="_Toc235283869"/>
+      <w:bookmarkStart w:id="11" w:name="_Toc236995803"/>
       <w:r>
         <w:rPr>
           <w:b/>
@@ -3667,7 +3729,7 @@
           <w:szCs w:val="28"/>
         </w:rPr>
       </w:pPr>
-      <w:bookmarkStart w:id="12" w:name="_Toc235283870"/>
+      <w:bookmarkStart w:id="12" w:name="_Toc236995804"/>
       <w:r>
         <w:rPr>
           <w:b/>
@@ -3788,7 +3850,7 @@
           <w:szCs w:val="28"/>
         </w:rPr>
       </w:pPr>
-      <w:bookmarkStart w:id="13" w:name="_Toc235283871"/>
+      <w:bookmarkStart w:id="13" w:name="_Toc236995805"/>
       <w:r>
         <w:rPr>
           <w:b/>
@@ -3909,7 +3971,7 @@
           <w:szCs w:val="28"/>
         </w:rPr>
       </w:pPr>
-      <w:bookmarkStart w:id="14" w:name="_Toc235283872"/>
+      <w:bookmarkStart w:id="14" w:name="_Toc236995806"/>
       <w:r>
         <w:rPr>
           <w:b/>
@@ -4030,7 +4092,7 @@
           <w:szCs w:val="28"/>
         </w:rPr>
       </w:pPr>
-      <w:bookmarkStart w:id="15" w:name="_Toc235283873"/>
+      <w:bookmarkStart w:id="15" w:name="_Toc236995807"/>
       <w:r>
         <w:rPr>
           <w:b/>
@@ -4148,7 +4210,7 @@
           <w:szCs w:val="28"/>
         </w:rPr>
       </w:pPr>
-      <w:bookmarkStart w:id="16" w:name="_Toc235283874"/>
+      <w:bookmarkStart w:id="16" w:name="_Toc236995808"/>
       <w:r>
         <w:rPr>
           <w:b/>
@@ -4262,7 +4324,7 @@
           <w:bCs/>
         </w:rPr>
       </w:pPr>
-      <w:bookmarkStart w:id="17" w:name="_Toc235283875"/>
+      <w:bookmarkStart w:id="17" w:name="_Toc236995809"/>
       <w:r>
         <w:rPr>
           <w:b/>
@@ -4857,7 +4919,7 @@
           <w:bCs/>
         </w:rPr>
       </w:pPr>
-      <w:bookmarkStart w:id="18" w:name="_Toc235283876"/>
+      <w:bookmarkStart w:id="18" w:name="_Toc236995810"/>
       <w:r>
         <w:rPr>
           <w:b/>
@@ -5062,25 +5124,7 @@
           <w:sz w:val="28"/>
           <w:szCs w:val="28"/>
         </w:rPr>
-        <w:t xml:space="preserve"> in “</w:t>
-      </w:r>
-      <w:proofErr w:type="gramStart"/>
-      <w:r>
-        <w:rPr>
-          <w:rFonts w:cs="Arial"/>
-          <w:sz w:val="28"/>
-          <w:szCs w:val="28"/>
-        </w:rPr>
-        <w:t>SUMIF(</w:t>
-      </w:r>
-      <w:proofErr w:type="gramEnd"/>
-      <w:r>
-        <w:rPr>
-          <w:rFonts w:cs="Arial"/>
-          <w:sz w:val="28"/>
-          <w:szCs w:val="28"/>
-        </w:rPr>
-        <w:t>)”</w:t>
+        <w:t xml:space="preserve"> in “SUMIF()”</w:t>
       </w:r>
       <w:r>
         <w:rPr>
@@ -5150,25 +5194,7 @@
           <w:sz w:val="28"/>
           <w:szCs w:val="28"/>
         </w:rPr>
-        <w:t>, otherwise the “</w:t>
-      </w:r>
-      <w:proofErr w:type="gramStart"/>
-      <w:r>
-        <w:rPr>
-          <w:rFonts w:cs="Arial"/>
-          <w:sz w:val="28"/>
-          <w:szCs w:val="28"/>
-        </w:rPr>
-        <w:t>SUMIF(</w:t>
-      </w:r>
-      <w:proofErr w:type="gramEnd"/>
-      <w:r>
-        <w:rPr>
-          <w:rFonts w:cs="Arial"/>
-          <w:sz w:val="28"/>
-          <w:szCs w:val="28"/>
-        </w:rPr>
-        <w:t>)” function will make an error</w:t>
+        <w:t>, otherwise the “SUMIF()” function will make an error</w:t>
       </w:r>
       <w:r>
         <w:rPr>
@@ -5455,7 +5481,7 @@
           <w:bCs/>
         </w:rPr>
       </w:pPr>
-      <w:bookmarkStart w:id="19" w:name="_Toc235283877"/>
+      <w:bookmarkStart w:id="19" w:name="_Toc236995811"/>
       <w:r>
         <w:rPr>
           <w:b/>
@@ -5473,7 +5499,7 @@
           <w:bCs/>
         </w:rPr>
       </w:pPr>
-      <w:bookmarkStart w:id="20" w:name="_Toc235283878"/>
+      <w:bookmarkStart w:id="20" w:name="_Toc236995812"/>
       <w:r>
         <w:rPr>
           <w:rStyle w:val="qwen-markdown-text"/>
@@ -6145,7 +6171,7 @@
           <w:bCs/>
         </w:rPr>
       </w:pPr>
-      <w:bookmarkStart w:id="21" w:name="_Toc235283879"/>
+      <w:bookmarkStart w:id="21" w:name="_Toc236995813"/>
       <w:r>
         <w:rPr>
           <w:rStyle w:val="qwen-markdown-text"/>
@@ -6971,7 +6997,7 @@
           <w:bCs/>
         </w:rPr>
       </w:pPr>
-      <w:bookmarkStart w:id="22" w:name="_Toc235283880"/>
+      <w:bookmarkStart w:id="22" w:name="_Toc236995814"/>
       <w:r>
         <w:rPr>
           <w:rStyle w:val="qwen-markdown-text"/>
@@ -7902,7 +7928,7 @@
           <w:bCs/>
         </w:rPr>
       </w:pPr>
-      <w:bookmarkStart w:id="23" w:name="_Toc235283881"/>
+      <w:bookmarkStart w:id="23" w:name="_Toc236995815"/>
       <w:r>
         <w:rPr>
           <w:b/>
@@ -8620,7 +8646,7 @@
           <w:bCs/>
         </w:rPr>
       </w:pPr>
-      <w:bookmarkStart w:id="24" w:name="_Toc235283882"/>
+      <w:bookmarkStart w:id="24" w:name="_Toc236995816"/>
       <w:r>
         <w:rPr>
           <w:rStyle w:val="qwen-markdown-text"/>
@@ -8642,7 +8668,7 @@
           <w:bCs/>
         </w:rPr>
       </w:pPr>
-      <w:bookmarkStart w:id="25" w:name="_Toc235283883"/>
+      <w:bookmarkStart w:id="25" w:name="_Toc236995817"/>
       <w:r>
         <w:rPr>
           <w:rStyle w:val="qwen-markdown-text"/>
@@ -8797,7 +8823,7 @@
           <w:bCs/>
         </w:rPr>
       </w:pPr>
-      <w:bookmarkStart w:id="26" w:name="_Toc235283884"/>
+      <w:bookmarkStart w:id="26" w:name="_Toc236995818"/>
       <w:r>
         <w:rPr>
           <w:rStyle w:val="qwen-markdown-text"/>
@@ -8934,7 +8960,7 @@
           <w:bCs/>
         </w:rPr>
       </w:pPr>
-      <w:bookmarkStart w:id="27" w:name="_Toc235283885"/>
+      <w:bookmarkStart w:id="27" w:name="_Toc236995819"/>
       <w:r>
         <w:rPr>
           <w:rStyle w:val="qwen-markdown-text"/>
@@ -9062,24 +9088,1212 @@
         </w:rPr>
       </w:pPr>
     </w:p>
-    <w:p/>
+    <w:p>
+      <w:pPr>
+        <w:spacing w:after="160" w:line="259" w:lineRule="auto"/>
+        <w:rPr>
+          <w:rFonts w:asciiTheme="minorBidi" w:hAnsiTheme="minorBidi" w:cstheme="minorBidi"/>
+          <w:color w:val="F7F8FC"/>
+          <w:sz w:val="28"/>
+          <w:szCs w:val="28"/>
+        </w:rPr>
+      </w:pPr>
+      <w:r>
+        <w:rPr>
+          <w:rFonts w:asciiTheme="minorBidi" w:hAnsiTheme="minorBidi" w:cstheme="minorBidi"/>
+          <w:color w:val="F7F8FC"/>
+          <w:sz w:val="28"/>
+          <w:szCs w:val="28"/>
+        </w:rPr>
+        <w:br w:type="page"/>
+      </w:r>
+    </w:p>
     <w:p>
       <w:pPr>
         <w:pStyle w:val="Heading1"/>
+      </w:pPr>
+      <w:bookmarkStart w:id="28" w:name="_Toc236995820"/>
+      <w:r>
+        <w:lastRenderedPageBreak/>
+        <w:t xml:space="preserve">Screens </w:t>
+      </w:r>
+      <w:r>
         <w:rPr>
           <w:b/>
           <w:bCs/>
         </w:rPr>
-      </w:pPr>
-      <w:bookmarkStart w:id="28" w:name="_Toc235283886"/>
-      <w:r>
+        <w:t>After</w:t>
+      </w:r>
+      <w:r>
+        <w:t xml:space="preserve"> </w:t>
+      </w:r>
+      <w:r>
+        <w:t>Implementation</w:t>
+      </w:r>
+      <w:bookmarkEnd w:id="28"/>
+    </w:p>
+    <w:p>
+      <w:pPr>
+        <w:rPr>
+          <w:i/>
+          <w:iCs/>
+          <w:sz w:val="28"/>
+          <w:szCs w:val="28"/>
+        </w:rPr>
+      </w:pPr>
+      <w:r>
+        <w:rPr>
+          <w:i/>
+          <w:iCs/>
+          <w:noProof/>
+          <w:sz w:val="28"/>
+          <w:szCs w:val="28"/>
+        </w:rPr>
+        <w:drawing>
+          <wp:anchor distT="0" distB="0" distL="114300" distR="114300" simplePos="0" relativeHeight="251660288" behindDoc="0" locked="0" layoutInCell="1" allowOverlap="1" wp14:anchorId="4053EE61" wp14:editId="449FD404">
+            <wp:simplePos x="0" y="0"/>
+            <wp:positionH relativeFrom="margin">
+              <wp:posOffset>1135380</wp:posOffset>
+            </wp:positionH>
+            <wp:positionV relativeFrom="paragraph">
+              <wp:posOffset>223520</wp:posOffset>
+            </wp:positionV>
+            <wp:extent cx="3450590" cy="4373245"/>
+            <wp:effectExtent l="0" t="0" r="0" b="8255"/>
+            <wp:wrapTopAndBottom/>
+            <wp:docPr id="4" name="Picture 4"/>
+            <wp:cNvGraphicFramePr>
+              <a:graphicFrameLocks xmlns:a="http://schemas.openxmlformats.org/drawingml/2006/main" noChangeAspect="1"/>
+            </wp:cNvGraphicFramePr>
+            <a:graphic xmlns:a="http://schemas.openxmlformats.org/drawingml/2006/main">
+              <a:graphicData uri="http://schemas.openxmlformats.org/drawingml/2006/picture">
+                <pic:pic xmlns:pic="http://schemas.openxmlformats.org/drawingml/2006/picture">
+                  <pic:nvPicPr>
+                    <pic:cNvPr id="1" name=""/>
+                    <pic:cNvPicPr/>
+                  </pic:nvPicPr>
+                  <pic:blipFill>
+                    <a:blip r:embed="rId19" cstate="print">
+                      <a:extLst>
+                        <a:ext uri="{28A0092B-C50C-407E-A947-70E740481C1C}">
+                          <a14:useLocalDpi xmlns:a14="http://schemas.microsoft.com/office/drawing/2010/main" val="0"/>
+                        </a:ext>
+                      </a:extLst>
+                    </a:blip>
+                    <a:stretch>
+                      <a:fillRect/>
+                    </a:stretch>
+                  </pic:blipFill>
+                  <pic:spPr>
+                    <a:xfrm>
+                      <a:off x="0" y="0"/>
+                      <a:ext cx="3450590" cy="4373245"/>
+                    </a:xfrm>
+                    <a:prstGeom prst="rect">
+                      <a:avLst/>
+                    </a:prstGeom>
+                  </pic:spPr>
+                </pic:pic>
+              </a:graphicData>
+            </a:graphic>
+            <wp14:sizeRelH relativeFrom="margin">
+              <wp14:pctWidth>0</wp14:pctWidth>
+            </wp14:sizeRelH>
+            <wp14:sizeRelV relativeFrom="margin">
+              <wp14:pctHeight>0</wp14:pctHeight>
+            </wp14:sizeRelV>
+          </wp:anchor>
+        </w:drawing>
+      </w:r>
+      <w:r>
+        <w:rPr>
+          <w:i/>
+          <w:iCs/>
+          <w:sz w:val="28"/>
+          <w:szCs w:val="28"/>
+        </w:rPr>
+        <w:t>Page 1: Project Cover &amp; Credentials.</w:t>
+      </w:r>
+    </w:p>
+    <w:p>
+      <w:pPr>
+        <w:jc w:val="center"/>
+        <w:rPr>
+          <w:sz w:val="28"/>
+          <w:szCs w:val="28"/>
+        </w:rPr>
+      </w:pPr>
+    </w:p>
+    <w:p>
+      <w:pPr>
+        <w:rPr>
+          <w:i/>
+          <w:iCs/>
+          <w:sz w:val="28"/>
+          <w:szCs w:val="28"/>
+        </w:rPr>
+      </w:pPr>
+      <w:r>
+        <w:rPr>
+          <w:noProof/>
+          <w:sz w:val="28"/>
+          <w:szCs w:val="28"/>
+        </w:rPr>
+        <w:drawing>
+          <wp:anchor distT="0" distB="0" distL="114300" distR="114300" simplePos="0" relativeHeight="251661312" behindDoc="0" locked="0" layoutInCell="1" allowOverlap="1" wp14:anchorId="0C512879" wp14:editId="698EC781">
+            <wp:simplePos x="0" y="0"/>
+            <wp:positionH relativeFrom="margin">
+              <wp:posOffset>751840</wp:posOffset>
+            </wp:positionH>
+            <wp:positionV relativeFrom="paragraph">
+              <wp:posOffset>226060</wp:posOffset>
+            </wp:positionV>
+            <wp:extent cx="3855720" cy="2787015"/>
+            <wp:effectExtent l="0" t="0" r="0" b="0"/>
+            <wp:wrapTopAndBottom/>
+            <wp:docPr id="2" name="Picture 2"/>
+            <wp:cNvGraphicFramePr>
+              <a:graphicFrameLocks xmlns:a="http://schemas.openxmlformats.org/drawingml/2006/main" noChangeAspect="1"/>
+            </wp:cNvGraphicFramePr>
+            <a:graphic xmlns:a="http://schemas.openxmlformats.org/drawingml/2006/main">
+              <a:graphicData uri="http://schemas.openxmlformats.org/drawingml/2006/picture">
+                <pic:pic xmlns:pic="http://schemas.openxmlformats.org/drawingml/2006/picture">
+                  <pic:nvPicPr>
+                    <pic:cNvPr id="1" name=""/>
+                    <pic:cNvPicPr/>
+                  </pic:nvPicPr>
+                  <pic:blipFill>
+                    <a:blip r:embed="rId20" cstate="print">
+                      <a:extLst>
+                        <a:ext uri="{28A0092B-C50C-407E-A947-70E740481C1C}">
+                          <a14:useLocalDpi xmlns:a14="http://schemas.microsoft.com/office/drawing/2010/main" val="0"/>
+                        </a:ext>
+                      </a:extLst>
+                    </a:blip>
+                    <a:stretch>
+                      <a:fillRect/>
+                    </a:stretch>
+                  </pic:blipFill>
+                  <pic:spPr>
+                    <a:xfrm>
+                      <a:off x="0" y="0"/>
+                      <a:ext cx="3855720" cy="2787015"/>
+                    </a:xfrm>
+                    <a:prstGeom prst="rect">
+                      <a:avLst/>
+                    </a:prstGeom>
+                  </pic:spPr>
+                </pic:pic>
+              </a:graphicData>
+            </a:graphic>
+            <wp14:sizeRelH relativeFrom="margin">
+              <wp14:pctWidth>0</wp14:pctWidth>
+            </wp14:sizeRelH>
+            <wp14:sizeRelV relativeFrom="margin">
+              <wp14:pctHeight>0</wp14:pctHeight>
+            </wp14:sizeRelV>
+          </wp:anchor>
+        </w:drawing>
+      </w:r>
+      <w:r>
+        <w:rPr>
+          <w:i/>
+          <w:iCs/>
+          <w:sz w:val="28"/>
+          <w:szCs w:val="28"/>
+        </w:rPr>
+        <w:t>Page 2: shows executive summery.</w:t>
+      </w:r>
+    </w:p>
+    <w:p>
+      <w:pPr>
+        <w:rPr>
+          <w:i/>
+          <w:iCs/>
+          <w:sz w:val="28"/>
+          <w:szCs w:val="28"/>
+        </w:rPr>
+      </w:pPr>
+      <w:r>
+        <w:rPr>
+          <w:i/>
+          <w:iCs/>
+          <w:sz w:val="28"/>
+          <w:szCs w:val="28"/>
+        </w:rPr>
+        <w:lastRenderedPageBreak/>
+        <w:t>Page 3: Inventory Status</w:t>
+      </w:r>
+    </w:p>
+    <w:p>
+      <w:pPr>
+        <w:jc w:val="center"/>
+        <w:rPr>
+          <w:sz w:val="28"/>
+          <w:szCs w:val="28"/>
+        </w:rPr>
+      </w:pPr>
+      <w:r>
+        <w:rPr>
+          <w:noProof/>
+          <w:sz w:val="28"/>
+          <w:szCs w:val="28"/>
+        </w:rPr>
+        <w:drawing>
+          <wp:anchor distT="0" distB="0" distL="114300" distR="114300" simplePos="0" relativeHeight="251662336" behindDoc="0" locked="0" layoutInCell="1" allowOverlap="1" wp14:anchorId="754C52B8" wp14:editId="0C0E5E66">
+            <wp:simplePos x="0" y="0"/>
+            <wp:positionH relativeFrom="margin">
+              <wp:align>center</wp:align>
+            </wp:positionH>
+            <wp:positionV relativeFrom="paragraph">
+              <wp:posOffset>112907</wp:posOffset>
+            </wp:positionV>
+            <wp:extent cx="5237299" cy="2869324"/>
+            <wp:effectExtent l="0" t="0" r="1905" b="7620"/>
+            <wp:wrapTopAndBottom/>
+            <wp:docPr id="5" name="Picture 5"/>
+            <wp:cNvGraphicFramePr>
+              <a:graphicFrameLocks xmlns:a="http://schemas.openxmlformats.org/drawingml/2006/main" noChangeAspect="1"/>
+            </wp:cNvGraphicFramePr>
+            <a:graphic xmlns:a="http://schemas.openxmlformats.org/drawingml/2006/main">
+              <a:graphicData uri="http://schemas.openxmlformats.org/drawingml/2006/picture">
+                <pic:pic xmlns:pic="http://schemas.openxmlformats.org/drawingml/2006/picture">
+                  <pic:nvPicPr>
+                    <pic:cNvPr id="1" name=""/>
+                    <pic:cNvPicPr/>
+                  </pic:nvPicPr>
+                  <pic:blipFill>
+                    <a:blip r:embed="rId21" cstate="print">
+                      <a:extLst>
+                        <a:ext uri="{28A0092B-C50C-407E-A947-70E740481C1C}">
+                          <a14:useLocalDpi xmlns:a14="http://schemas.microsoft.com/office/drawing/2010/main" val="0"/>
+                        </a:ext>
+                      </a:extLst>
+                    </a:blip>
+                    <a:stretch>
+                      <a:fillRect/>
+                    </a:stretch>
+                  </pic:blipFill>
+                  <pic:spPr>
+                    <a:xfrm>
+                      <a:off x="0" y="0"/>
+                      <a:ext cx="5237299" cy="2869324"/>
+                    </a:xfrm>
+                    <a:prstGeom prst="rect">
+                      <a:avLst/>
+                    </a:prstGeom>
+                  </pic:spPr>
+                </pic:pic>
+              </a:graphicData>
+            </a:graphic>
+          </wp:anchor>
+        </w:drawing>
+      </w:r>
+    </w:p>
+    <w:p>
+      <w:pPr>
+        <w:rPr>
+          <w:sz w:val="28"/>
+          <w:szCs w:val="28"/>
+        </w:rPr>
+      </w:pPr>
+    </w:p>
+    <w:p>
+      <w:pPr>
+        <w:rPr>
+          <w:i/>
+          <w:iCs/>
+          <w:sz w:val="28"/>
+          <w:szCs w:val="28"/>
+        </w:rPr>
+      </w:pPr>
+      <w:r>
+        <w:rPr>
+          <w:i/>
+          <w:iCs/>
+          <w:noProof/>
+          <w:sz w:val="28"/>
+          <w:szCs w:val="28"/>
+        </w:rPr>
+        <w:drawing>
+          <wp:anchor distT="0" distB="0" distL="114300" distR="114300" simplePos="0" relativeHeight="251663360" behindDoc="0" locked="0" layoutInCell="1" allowOverlap="1" wp14:anchorId="1E4824C8" wp14:editId="50B7C933">
+            <wp:simplePos x="0" y="0"/>
+            <wp:positionH relativeFrom="margin">
+              <wp:align>center</wp:align>
+            </wp:positionH>
+            <wp:positionV relativeFrom="paragraph">
+              <wp:posOffset>416478</wp:posOffset>
+            </wp:positionV>
+            <wp:extent cx="5310324" cy="2979682"/>
+            <wp:effectExtent l="0" t="0" r="5080" b="0"/>
+            <wp:wrapTopAndBottom/>
+            <wp:docPr id="6" name="Picture 6"/>
+            <wp:cNvGraphicFramePr>
+              <a:graphicFrameLocks xmlns:a="http://schemas.openxmlformats.org/drawingml/2006/main" noChangeAspect="1"/>
+            </wp:cNvGraphicFramePr>
+            <a:graphic xmlns:a="http://schemas.openxmlformats.org/drawingml/2006/main">
+              <a:graphicData uri="http://schemas.openxmlformats.org/drawingml/2006/picture">
+                <pic:pic xmlns:pic="http://schemas.openxmlformats.org/drawingml/2006/picture">
+                  <pic:nvPicPr>
+                    <pic:cNvPr id="1" name=""/>
+                    <pic:cNvPicPr/>
+                  </pic:nvPicPr>
+                  <pic:blipFill>
+                    <a:blip r:embed="rId22" cstate="print">
+                      <a:extLst>
+                        <a:ext uri="{28A0092B-C50C-407E-A947-70E740481C1C}">
+                          <a14:useLocalDpi xmlns:a14="http://schemas.microsoft.com/office/drawing/2010/main" val="0"/>
+                        </a:ext>
+                      </a:extLst>
+                    </a:blip>
+                    <a:stretch>
+                      <a:fillRect/>
+                    </a:stretch>
+                  </pic:blipFill>
+                  <pic:spPr>
+                    <a:xfrm>
+                      <a:off x="0" y="0"/>
+                      <a:ext cx="5310324" cy="2979682"/>
+                    </a:xfrm>
+                    <a:prstGeom prst="rect">
+                      <a:avLst/>
+                    </a:prstGeom>
+                  </pic:spPr>
+                </pic:pic>
+              </a:graphicData>
+            </a:graphic>
+          </wp:anchor>
+        </w:drawing>
+      </w:r>
+      <w:r>
+        <w:rPr>
+          <w:i/>
+          <w:iCs/>
+          <w:sz w:val="28"/>
+          <w:szCs w:val="28"/>
+        </w:rPr>
+        <w:t xml:space="preserve">Page </w:t>
+      </w:r>
+      <w:r>
+        <w:rPr>
+          <w:i/>
+          <w:iCs/>
+          <w:sz w:val="28"/>
+          <w:szCs w:val="28"/>
+        </w:rPr>
+        <w:t>4: Search and filters.</w:t>
+      </w:r>
+    </w:p>
+    <w:p>
+      <w:pPr>
+        <w:rPr>
+          <w:sz w:val="28"/>
+          <w:szCs w:val="28"/>
+        </w:rPr>
+      </w:pPr>
+      <w:r>
+        <w:rPr>
+          <w:sz w:val="28"/>
+          <w:szCs w:val="28"/>
+        </w:rPr>
+        <w:br w:type="page"/>
+      </w:r>
+    </w:p>
+    <w:p>
+      <w:pPr>
+        <w:rPr>
+          <w:i/>
+          <w:iCs/>
+          <w:sz w:val="28"/>
+          <w:szCs w:val="28"/>
+        </w:rPr>
+      </w:pPr>
+      <w:r>
+        <w:rPr>
+          <w:i/>
+          <w:iCs/>
+          <w:noProof/>
+          <w:sz w:val="28"/>
+          <w:szCs w:val="28"/>
+        </w:rPr>
+        <w:lastRenderedPageBreak/>
+        <w:drawing>
+          <wp:anchor distT="0" distB="0" distL="114300" distR="114300" simplePos="0" relativeHeight="251664384" behindDoc="0" locked="0" layoutInCell="1" allowOverlap="1" wp14:anchorId="35AE7A60" wp14:editId="01998E58">
+            <wp:simplePos x="0" y="0"/>
+            <wp:positionH relativeFrom="margin">
+              <wp:posOffset>235585</wp:posOffset>
+            </wp:positionH>
+            <wp:positionV relativeFrom="paragraph">
+              <wp:posOffset>280035</wp:posOffset>
+            </wp:positionV>
+            <wp:extent cx="5244465" cy="2934335"/>
+            <wp:effectExtent l="0" t="0" r="0" b="0"/>
+            <wp:wrapTopAndBottom/>
+            <wp:docPr id="7" name="Picture 7"/>
+            <wp:cNvGraphicFramePr>
+              <a:graphicFrameLocks xmlns:a="http://schemas.openxmlformats.org/drawingml/2006/main" noChangeAspect="1"/>
+            </wp:cNvGraphicFramePr>
+            <a:graphic xmlns:a="http://schemas.openxmlformats.org/drawingml/2006/main">
+              <a:graphicData uri="http://schemas.openxmlformats.org/drawingml/2006/picture">
+                <pic:pic xmlns:pic="http://schemas.openxmlformats.org/drawingml/2006/picture">
+                  <pic:nvPicPr>
+                    <pic:cNvPr id="1" name=""/>
+                    <pic:cNvPicPr/>
+                  </pic:nvPicPr>
+                  <pic:blipFill>
+                    <a:blip r:embed="rId23" cstate="print">
+                      <a:extLst>
+                        <a:ext uri="{28A0092B-C50C-407E-A947-70E740481C1C}">
+                          <a14:useLocalDpi xmlns:a14="http://schemas.microsoft.com/office/drawing/2010/main" val="0"/>
+                        </a:ext>
+                      </a:extLst>
+                    </a:blip>
+                    <a:stretch>
+                      <a:fillRect/>
+                    </a:stretch>
+                  </pic:blipFill>
+                  <pic:spPr>
+                    <a:xfrm>
+                      <a:off x="0" y="0"/>
+                      <a:ext cx="5244465" cy="2934335"/>
+                    </a:xfrm>
+                    <a:prstGeom prst="rect">
+                      <a:avLst/>
+                    </a:prstGeom>
+                  </pic:spPr>
+                </pic:pic>
+              </a:graphicData>
+            </a:graphic>
+            <wp14:sizeRelH relativeFrom="margin">
+              <wp14:pctWidth>0</wp14:pctWidth>
+            </wp14:sizeRelH>
+            <wp14:sizeRelV relativeFrom="margin">
+              <wp14:pctHeight>0</wp14:pctHeight>
+            </wp14:sizeRelV>
+          </wp:anchor>
+        </w:drawing>
+      </w:r>
+      <w:r>
+        <w:rPr>
+          <w:i/>
+          <w:iCs/>
+          <w:sz w:val="28"/>
+          <w:szCs w:val="28"/>
+        </w:rPr>
+        <w:t>Page 5: Restock by Priority</w:t>
+      </w:r>
+    </w:p>
+    <w:p>
+      <w:pPr>
+        <w:jc w:val="center"/>
+        <w:rPr>
+          <w:sz w:val="28"/>
+          <w:szCs w:val="28"/>
+        </w:rPr>
+      </w:pPr>
+    </w:p>
+    <w:p>
+      <w:pPr>
+        <w:jc w:val="center"/>
+        <w:rPr>
+          <w:sz w:val="28"/>
+          <w:szCs w:val="28"/>
+        </w:rPr>
+      </w:pPr>
+    </w:p>
+    <w:p>
+      <w:pPr>
+        <w:rPr>
+          <w:i/>
+          <w:iCs/>
+          <w:sz w:val="28"/>
+          <w:szCs w:val="28"/>
+        </w:rPr>
+      </w:pPr>
+      <w:r>
+        <w:rPr>
+          <w:i/>
+          <w:iCs/>
+          <w:noProof/>
+          <w:sz w:val="28"/>
+          <w:szCs w:val="28"/>
+        </w:rPr>
+        <w:drawing>
+          <wp:anchor distT="0" distB="0" distL="114300" distR="114300" simplePos="0" relativeHeight="251665408" behindDoc="0" locked="0" layoutInCell="1" allowOverlap="1" wp14:anchorId="7AF674CC" wp14:editId="5BEBA41B">
+            <wp:simplePos x="0" y="0"/>
+            <wp:positionH relativeFrom="margin">
+              <wp:align>center</wp:align>
+            </wp:positionH>
+            <wp:positionV relativeFrom="paragraph">
+              <wp:posOffset>282186</wp:posOffset>
+            </wp:positionV>
+            <wp:extent cx="5376754" cy="3011213"/>
+            <wp:effectExtent l="0" t="0" r="0" b="0"/>
+            <wp:wrapTopAndBottom/>
+            <wp:docPr id="8" name="Picture 8"/>
+            <wp:cNvGraphicFramePr>
+              <a:graphicFrameLocks xmlns:a="http://schemas.openxmlformats.org/drawingml/2006/main" noChangeAspect="1"/>
+            </wp:cNvGraphicFramePr>
+            <a:graphic xmlns:a="http://schemas.openxmlformats.org/drawingml/2006/main">
+              <a:graphicData uri="http://schemas.openxmlformats.org/drawingml/2006/picture">
+                <pic:pic xmlns:pic="http://schemas.openxmlformats.org/drawingml/2006/picture">
+                  <pic:nvPicPr>
+                    <pic:cNvPr id="1" name=""/>
+                    <pic:cNvPicPr/>
+                  </pic:nvPicPr>
+                  <pic:blipFill>
+                    <a:blip r:embed="rId24" cstate="print">
+                      <a:extLst>
+                        <a:ext uri="{28A0092B-C50C-407E-A947-70E740481C1C}">
+                          <a14:useLocalDpi xmlns:a14="http://schemas.microsoft.com/office/drawing/2010/main" val="0"/>
+                        </a:ext>
+                      </a:extLst>
+                    </a:blip>
+                    <a:stretch>
+                      <a:fillRect/>
+                    </a:stretch>
+                  </pic:blipFill>
+                  <pic:spPr>
+                    <a:xfrm>
+                      <a:off x="0" y="0"/>
+                      <a:ext cx="5376754" cy="3011213"/>
+                    </a:xfrm>
+                    <a:prstGeom prst="rect">
+                      <a:avLst/>
+                    </a:prstGeom>
+                  </pic:spPr>
+                </pic:pic>
+              </a:graphicData>
+            </a:graphic>
+          </wp:anchor>
+        </w:drawing>
+      </w:r>
+      <w:r>
+        <w:rPr>
+          <w:i/>
+          <w:iCs/>
+          <w:sz w:val="28"/>
+          <w:szCs w:val="28"/>
+        </w:rPr>
+        <w:t xml:space="preserve">Page </w:t>
+      </w:r>
+      <w:r>
+        <w:rPr>
+          <w:i/>
+          <w:iCs/>
+          <w:sz w:val="28"/>
+          <w:szCs w:val="28"/>
+        </w:rPr>
+        <w:t>6: High Consumption Medications</w:t>
+      </w:r>
+    </w:p>
+    <w:p>
+      <w:pPr>
+        <w:rPr>
+          <w:sz w:val="28"/>
+          <w:szCs w:val="28"/>
+        </w:rPr>
+      </w:pPr>
+      <w:r>
+        <w:rPr>
+          <w:sz w:val="28"/>
+          <w:szCs w:val="28"/>
+        </w:rPr>
+        <w:br w:type="page"/>
+      </w:r>
+    </w:p>
+    <w:p>
+      <w:pPr>
+        <w:rPr>
+          <w:i/>
+          <w:iCs/>
+          <w:sz w:val="28"/>
+          <w:szCs w:val="28"/>
+        </w:rPr>
+      </w:pPr>
+      <w:r>
+        <w:rPr>
+          <w:noProof/>
+          <w:sz w:val="28"/>
+          <w:szCs w:val="28"/>
+        </w:rPr>
+        <w:lastRenderedPageBreak/>
+        <w:drawing>
+          <wp:anchor distT="0" distB="0" distL="114300" distR="114300" simplePos="0" relativeHeight="251666432" behindDoc="0" locked="0" layoutInCell="1" allowOverlap="1" wp14:anchorId="7A0377B2" wp14:editId="10C195D5">
+            <wp:simplePos x="0" y="0"/>
+            <wp:positionH relativeFrom="column">
+              <wp:posOffset>471805</wp:posOffset>
+            </wp:positionH>
+            <wp:positionV relativeFrom="paragraph">
+              <wp:posOffset>305435</wp:posOffset>
+            </wp:positionV>
+            <wp:extent cx="5000625" cy="3436620"/>
+            <wp:effectExtent l="0" t="0" r="9525" b="0"/>
+            <wp:wrapTopAndBottom/>
+            <wp:docPr id="9" name="Picture 9"/>
+            <wp:cNvGraphicFramePr>
+              <a:graphicFrameLocks xmlns:a="http://schemas.openxmlformats.org/drawingml/2006/main" noChangeAspect="1"/>
+            </wp:cNvGraphicFramePr>
+            <a:graphic xmlns:a="http://schemas.openxmlformats.org/drawingml/2006/main">
+              <a:graphicData uri="http://schemas.openxmlformats.org/drawingml/2006/picture">
+                <pic:pic xmlns:pic="http://schemas.openxmlformats.org/drawingml/2006/picture">
+                  <pic:nvPicPr>
+                    <pic:cNvPr id="1" name=""/>
+                    <pic:cNvPicPr/>
+                  </pic:nvPicPr>
+                  <pic:blipFill>
+                    <a:blip r:embed="rId25">
+                      <a:extLst>
+                        <a:ext uri="{28A0092B-C50C-407E-A947-70E740481C1C}">
+                          <a14:useLocalDpi xmlns:a14="http://schemas.microsoft.com/office/drawing/2010/main" val="0"/>
+                        </a:ext>
+                      </a:extLst>
+                    </a:blip>
+                    <a:stretch>
+                      <a:fillRect/>
+                    </a:stretch>
+                  </pic:blipFill>
+                  <pic:spPr>
+                    <a:xfrm>
+                      <a:off x="0" y="0"/>
+                      <a:ext cx="5000625" cy="3436620"/>
+                    </a:xfrm>
+                    <a:prstGeom prst="rect">
+                      <a:avLst/>
+                    </a:prstGeom>
+                  </pic:spPr>
+                </pic:pic>
+              </a:graphicData>
+            </a:graphic>
+          </wp:anchor>
+        </w:drawing>
+      </w:r>
+      <w:r>
+        <w:rPr>
+          <w:i/>
+          <w:iCs/>
+          <w:sz w:val="28"/>
+          <w:szCs w:val="28"/>
+        </w:rPr>
+        <w:t>Page 7: Expiring Soon Medications.</w:t>
+      </w:r>
+    </w:p>
+    <w:p>
+      <w:pPr>
+        <w:jc w:val="center"/>
+        <w:rPr>
+          <w:sz w:val="28"/>
+          <w:szCs w:val="28"/>
+        </w:rPr>
+      </w:pPr>
+    </w:p>
+    <w:p>
+      <w:pPr>
+        <w:jc w:val="center"/>
+        <w:rPr>
+          <w:sz w:val="28"/>
+          <w:szCs w:val="28"/>
+        </w:rPr>
+      </w:pPr>
+    </w:p>
+    <w:p>
+      <w:pPr>
+        <w:rPr>
+          <w:i/>
+          <w:iCs/>
+          <w:sz w:val="28"/>
+          <w:szCs w:val="28"/>
+        </w:rPr>
+      </w:pPr>
+      <w:r>
+        <w:rPr>
+          <w:i/>
+          <w:iCs/>
+          <w:sz w:val="28"/>
+          <w:szCs w:val="28"/>
+        </w:rPr>
+        <w:t>Page 8: Eye Medication Supplies</w:t>
+      </w:r>
+    </w:p>
+    <w:p>
+      <w:pPr>
+        <w:rPr>
+          <w:sz w:val="28"/>
+          <w:szCs w:val="28"/>
+        </w:rPr>
+      </w:pPr>
+      <w:r>
+        <w:rPr>
+          <w:noProof/>
+          <w:sz w:val="28"/>
+          <w:szCs w:val="28"/>
+        </w:rPr>
+        <w:drawing>
+          <wp:anchor distT="0" distB="0" distL="114300" distR="114300" simplePos="0" relativeHeight="251667456" behindDoc="0" locked="0" layoutInCell="1" allowOverlap="1" wp14:anchorId="0111DD0F" wp14:editId="255A26A6">
+            <wp:simplePos x="0" y="0"/>
+            <wp:positionH relativeFrom="margin">
+              <wp:align>center</wp:align>
+            </wp:positionH>
+            <wp:positionV relativeFrom="paragraph">
+              <wp:posOffset>6719</wp:posOffset>
+            </wp:positionV>
+            <wp:extent cx="5120831" cy="2837793"/>
+            <wp:effectExtent l="0" t="0" r="3810" b="1270"/>
+            <wp:wrapTopAndBottom/>
+            <wp:docPr id="3" name="Picture 3"/>
+            <wp:cNvGraphicFramePr>
+              <a:graphicFrameLocks xmlns:a="http://schemas.openxmlformats.org/drawingml/2006/main" noChangeAspect="1"/>
+            </wp:cNvGraphicFramePr>
+            <a:graphic xmlns:a="http://schemas.openxmlformats.org/drawingml/2006/main">
+              <a:graphicData uri="http://schemas.openxmlformats.org/drawingml/2006/picture">
+                <pic:pic xmlns:pic="http://schemas.openxmlformats.org/drawingml/2006/picture">
+                  <pic:nvPicPr>
+                    <pic:cNvPr id="1" name=""/>
+                    <pic:cNvPicPr/>
+                  </pic:nvPicPr>
+                  <pic:blipFill>
+                    <a:blip r:embed="rId26" cstate="print">
+                      <a:extLst>
+                        <a:ext uri="{28A0092B-C50C-407E-A947-70E740481C1C}">
+                          <a14:useLocalDpi xmlns:a14="http://schemas.microsoft.com/office/drawing/2010/main" val="0"/>
+                        </a:ext>
+                      </a:extLst>
+                    </a:blip>
+                    <a:stretch>
+                      <a:fillRect/>
+                    </a:stretch>
+                  </pic:blipFill>
+                  <pic:spPr>
+                    <a:xfrm>
+                      <a:off x="0" y="0"/>
+                      <a:ext cx="5120831" cy="2837793"/>
+                    </a:xfrm>
+                    <a:prstGeom prst="rect">
+                      <a:avLst/>
+                    </a:prstGeom>
+                  </pic:spPr>
+                </pic:pic>
+              </a:graphicData>
+            </a:graphic>
+          </wp:anchor>
+        </w:drawing>
+      </w:r>
+      <w:r>
+        <w:rPr>
+          <w:sz w:val="28"/>
+          <w:szCs w:val="28"/>
+        </w:rPr>
+        <w:br w:type="page"/>
+      </w:r>
+    </w:p>
+    <w:p>
+      <w:pPr>
+        <w:rPr>
+          <w:i/>
+          <w:iCs/>
+          <w:sz w:val="28"/>
+          <w:szCs w:val="28"/>
+        </w:rPr>
+      </w:pPr>
+      <w:r>
+        <w:rPr>
+          <w:noProof/>
+          <w:sz w:val="28"/>
+          <w:szCs w:val="28"/>
+        </w:rPr>
+        <w:lastRenderedPageBreak/>
+        <w:drawing>
+          <wp:anchor distT="0" distB="0" distL="114300" distR="114300" simplePos="0" relativeHeight="251668480" behindDoc="0" locked="0" layoutInCell="1" allowOverlap="1" wp14:anchorId="0E896981" wp14:editId="6BA0E914">
+            <wp:simplePos x="0" y="0"/>
+            <wp:positionH relativeFrom="margin">
+              <wp:align>center</wp:align>
+            </wp:positionH>
+            <wp:positionV relativeFrom="paragraph">
+              <wp:posOffset>335915</wp:posOffset>
+            </wp:positionV>
+            <wp:extent cx="5179695" cy="2900680"/>
+            <wp:effectExtent l="0" t="0" r="1905" b="0"/>
+            <wp:wrapTopAndBottom/>
+            <wp:docPr id="10" name="Picture 10"/>
+            <wp:cNvGraphicFramePr>
+              <a:graphicFrameLocks xmlns:a="http://schemas.openxmlformats.org/drawingml/2006/main" noChangeAspect="1"/>
+            </wp:cNvGraphicFramePr>
+            <a:graphic xmlns:a="http://schemas.openxmlformats.org/drawingml/2006/main">
+              <a:graphicData uri="http://schemas.openxmlformats.org/drawingml/2006/picture">
+                <pic:pic xmlns:pic="http://schemas.openxmlformats.org/drawingml/2006/picture">
+                  <pic:nvPicPr>
+                    <pic:cNvPr id="1" name=""/>
+                    <pic:cNvPicPr/>
+                  </pic:nvPicPr>
+                  <pic:blipFill>
+                    <a:blip r:embed="rId27" cstate="print">
+                      <a:extLst>
+                        <a:ext uri="{28A0092B-C50C-407E-A947-70E740481C1C}">
+                          <a14:useLocalDpi xmlns:a14="http://schemas.microsoft.com/office/drawing/2010/main" val="0"/>
+                        </a:ext>
+                      </a:extLst>
+                    </a:blip>
+                    <a:stretch>
+                      <a:fillRect/>
+                    </a:stretch>
+                  </pic:blipFill>
+                  <pic:spPr>
+                    <a:xfrm>
+                      <a:off x="0" y="0"/>
+                      <a:ext cx="5179695" cy="2900680"/>
+                    </a:xfrm>
+                    <a:prstGeom prst="rect">
+                      <a:avLst/>
+                    </a:prstGeom>
+                  </pic:spPr>
+                </pic:pic>
+              </a:graphicData>
+            </a:graphic>
+          </wp:anchor>
+        </w:drawing>
+      </w:r>
+      <w:r>
+        <w:rPr>
+          <w:i/>
+          <w:iCs/>
+          <w:sz w:val="28"/>
+          <w:szCs w:val="28"/>
+        </w:rPr>
+        <w:t xml:space="preserve">Page 9: Antibiotics Supplies </w:t>
+      </w:r>
+    </w:p>
+    <w:p>
+      <w:pPr>
+        <w:jc w:val="center"/>
+        <w:rPr>
+          <w:sz w:val="28"/>
+          <w:szCs w:val="28"/>
+        </w:rPr>
+      </w:pPr>
+    </w:p>
+    <w:p>
+      <w:pPr>
+        <w:jc w:val="center"/>
+        <w:rPr>
+          <w:sz w:val="28"/>
+          <w:szCs w:val="28"/>
+        </w:rPr>
+      </w:pPr>
+    </w:p>
+    <w:p>
+      <w:pPr>
+        <w:rPr>
+          <w:i/>
+          <w:iCs/>
+          <w:sz w:val="28"/>
+          <w:szCs w:val="28"/>
+        </w:rPr>
+      </w:pPr>
+      <w:r>
+        <w:rPr>
+          <w:i/>
+          <w:iCs/>
+          <w:noProof/>
+          <w:sz w:val="28"/>
+          <w:szCs w:val="28"/>
+        </w:rPr>
+        <w:drawing>
+          <wp:anchor distT="0" distB="0" distL="114300" distR="114300" simplePos="0" relativeHeight="251669504" behindDoc="0" locked="0" layoutInCell="1" allowOverlap="1" wp14:anchorId="6928D1CA" wp14:editId="5E052792">
+            <wp:simplePos x="0" y="0"/>
+            <wp:positionH relativeFrom="margin">
+              <wp:align>center</wp:align>
+            </wp:positionH>
+            <wp:positionV relativeFrom="paragraph">
+              <wp:posOffset>237490</wp:posOffset>
+            </wp:positionV>
+            <wp:extent cx="5361305" cy="2963545"/>
+            <wp:effectExtent l="0" t="0" r="0" b="8255"/>
+            <wp:wrapTopAndBottom/>
+            <wp:docPr id="11" name="Picture 11"/>
+            <wp:cNvGraphicFramePr>
+              <a:graphicFrameLocks xmlns:a="http://schemas.openxmlformats.org/drawingml/2006/main" noChangeAspect="1"/>
+            </wp:cNvGraphicFramePr>
+            <a:graphic xmlns:a="http://schemas.openxmlformats.org/drawingml/2006/main">
+              <a:graphicData uri="http://schemas.openxmlformats.org/drawingml/2006/picture">
+                <pic:pic xmlns:pic="http://schemas.openxmlformats.org/drawingml/2006/picture">
+                  <pic:nvPicPr>
+                    <pic:cNvPr id="1" name=""/>
+                    <pic:cNvPicPr/>
+                  </pic:nvPicPr>
+                  <pic:blipFill>
+                    <a:blip r:embed="rId28" cstate="print">
+                      <a:extLst>
+                        <a:ext uri="{28A0092B-C50C-407E-A947-70E740481C1C}">
+                          <a14:useLocalDpi xmlns:a14="http://schemas.microsoft.com/office/drawing/2010/main" val="0"/>
+                        </a:ext>
+                      </a:extLst>
+                    </a:blip>
+                    <a:stretch>
+                      <a:fillRect/>
+                    </a:stretch>
+                  </pic:blipFill>
+                  <pic:spPr>
+                    <a:xfrm>
+                      <a:off x="0" y="0"/>
+                      <a:ext cx="5361305" cy="2963545"/>
+                    </a:xfrm>
+                    <a:prstGeom prst="rect">
+                      <a:avLst/>
+                    </a:prstGeom>
+                  </pic:spPr>
+                </pic:pic>
+              </a:graphicData>
+            </a:graphic>
+          </wp:anchor>
+        </w:drawing>
+      </w:r>
+      <w:r>
+        <w:rPr>
+          <w:i/>
+          <w:iCs/>
+          <w:sz w:val="28"/>
+          <w:szCs w:val="28"/>
+        </w:rPr>
+        <w:t>Page 10: Slow Moving Medications.</w:t>
+      </w:r>
+    </w:p>
+    <w:p>
+      <w:pPr>
+        <w:rPr>
+          <w:sz w:val="28"/>
+          <w:szCs w:val="28"/>
+        </w:rPr>
+      </w:pPr>
+      <w:r>
+        <w:rPr>
+          <w:sz w:val="28"/>
+          <w:szCs w:val="28"/>
+        </w:rPr>
+        <w:br w:type="page"/>
+      </w:r>
+    </w:p>
+    <w:p>
+      <w:pPr>
+        <w:rPr>
+          <w:i/>
+          <w:iCs/>
+          <w:sz w:val="28"/>
+          <w:szCs w:val="28"/>
+        </w:rPr>
+      </w:pPr>
+      <w:r>
+        <w:rPr>
+          <w:noProof/>
+          <w:sz w:val="28"/>
+          <w:szCs w:val="28"/>
+        </w:rPr>
+        <w:lastRenderedPageBreak/>
+        <w:drawing>
+          <wp:anchor distT="0" distB="0" distL="114300" distR="114300" simplePos="0" relativeHeight="251670528" behindDoc="0" locked="0" layoutInCell="1" allowOverlap="1" wp14:anchorId="06CBE92E" wp14:editId="5FD541C9">
+            <wp:simplePos x="0" y="0"/>
+            <wp:positionH relativeFrom="column">
+              <wp:posOffset>412750</wp:posOffset>
+            </wp:positionH>
+            <wp:positionV relativeFrom="paragraph">
+              <wp:posOffset>343535</wp:posOffset>
+            </wp:positionV>
+            <wp:extent cx="5104765" cy="2853055"/>
+            <wp:effectExtent l="0" t="0" r="635" b="4445"/>
+            <wp:wrapTopAndBottom/>
+            <wp:docPr id="12" name="Picture 12"/>
+            <wp:cNvGraphicFramePr>
+              <a:graphicFrameLocks xmlns:a="http://schemas.openxmlformats.org/drawingml/2006/main" noChangeAspect="1"/>
+            </wp:cNvGraphicFramePr>
+            <a:graphic xmlns:a="http://schemas.openxmlformats.org/drawingml/2006/main">
+              <a:graphicData uri="http://schemas.openxmlformats.org/drawingml/2006/picture">
+                <pic:pic xmlns:pic="http://schemas.openxmlformats.org/drawingml/2006/picture">
+                  <pic:nvPicPr>
+                    <pic:cNvPr id="1" name=""/>
+                    <pic:cNvPicPr/>
+                  </pic:nvPicPr>
+                  <pic:blipFill>
+                    <a:blip r:embed="rId29" cstate="print">
+                      <a:extLst>
+                        <a:ext uri="{28A0092B-C50C-407E-A947-70E740481C1C}">
+                          <a14:useLocalDpi xmlns:a14="http://schemas.microsoft.com/office/drawing/2010/main" val="0"/>
+                        </a:ext>
+                      </a:extLst>
+                    </a:blip>
+                    <a:stretch>
+                      <a:fillRect/>
+                    </a:stretch>
+                  </pic:blipFill>
+                  <pic:spPr>
+                    <a:xfrm>
+                      <a:off x="0" y="0"/>
+                      <a:ext cx="5104765" cy="2853055"/>
+                    </a:xfrm>
+                    <a:prstGeom prst="rect">
+                      <a:avLst/>
+                    </a:prstGeom>
+                  </pic:spPr>
+                </pic:pic>
+              </a:graphicData>
+            </a:graphic>
+          </wp:anchor>
+        </w:drawing>
+      </w:r>
+      <w:r>
+        <w:rPr>
+          <w:i/>
+          <w:iCs/>
+          <w:sz w:val="28"/>
+          <w:szCs w:val="28"/>
+        </w:rPr>
+        <w:t>Page 11: Explore Tablets</w:t>
+      </w:r>
+    </w:p>
+    <w:p>
+      <w:pPr>
+        <w:jc w:val="center"/>
+        <w:rPr>
+          <w:sz w:val="28"/>
+          <w:szCs w:val="28"/>
+        </w:rPr>
+      </w:pPr>
+    </w:p>
+    <w:p>
+      <w:pPr>
+        <w:jc w:val="center"/>
+        <w:rPr>
+          <w:sz w:val="28"/>
+          <w:szCs w:val="28"/>
+        </w:rPr>
+      </w:pPr>
+    </w:p>
+    <w:p>
+      <w:pPr>
+        <w:jc w:val="center"/>
+        <w:rPr>
+          <w:sz w:val="28"/>
+          <w:szCs w:val="28"/>
+        </w:rPr>
+      </w:pPr>
+    </w:p>
+    <w:p>
+      <w:pPr>
+        <w:rPr>
+          <w:i/>
+          <w:iCs/>
+          <w:sz w:val="28"/>
+          <w:szCs w:val="28"/>
+        </w:rPr>
+      </w:pPr>
+      <w:r>
+        <w:rPr>
+          <w:i/>
+          <w:iCs/>
+          <w:noProof/>
+          <w:sz w:val="28"/>
+          <w:szCs w:val="28"/>
+        </w:rPr>
+        <w:drawing>
+          <wp:anchor distT="0" distB="0" distL="114300" distR="114300" simplePos="0" relativeHeight="251671552" behindDoc="0" locked="0" layoutInCell="1" allowOverlap="1" wp14:anchorId="109C5ABA" wp14:editId="595149EA">
+            <wp:simplePos x="0" y="0"/>
+            <wp:positionH relativeFrom="margin">
+              <wp:align>center</wp:align>
+            </wp:positionH>
+            <wp:positionV relativeFrom="paragraph">
+              <wp:posOffset>310688</wp:posOffset>
+            </wp:positionV>
+            <wp:extent cx="5220335" cy="2899410"/>
+            <wp:effectExtent l="0" t="0" r="0" b="0"/>
+            <wp:wrapTopAndBottom/>
+            <wp:docPr id="13" name="Picture 13"/>
+            <wp:cNvGraphicFramePr>
+              <a:graphicFrameLocks xmlns:a="http://schemas.openxmlformats.org/drawingml/2006/main" noChangeAspect="1"/>
+            </wp:cNvGraphicFramePr>
+            <a:graphic xmlns:a="http://schemas.openxmlformats.org/drawingml/2006/main">
+              <a:graphicData uri="http://schemas.openxmlformats.org/drawingml/2006/picture">
+                <pic:pic xmlns:pic="http://schemas.openxmlformats.org/drawingml/2006/picture">
+                  <pic:nvPicPr>
+                    <pic:cNvPr id="1" name=""/>
+                    <pic:cNvPicPr/>
+                  </pic:nvPicPr>
+                  <pic:blipFill>
+                    <a:blip r:embed="rId30" cstate="print">
+                      <a:extLst>
+                        <a:ext uri="{28A0092B-C50C-407E-A947-70E740481C1C}">
+                          <a14:useLocalDpi xmlns:a14="http://schemas.microsoft.com/office/drawing/2010/main" val="0"/>
+                        </a:ext>
+                      </a:extLst>
+                    </a:blip>
+                    <a:stretch>
+                      <a:fillRect/>
+                    </a:stretch>
+                  </pic:blipFill>
+                  <pic:spPr>
+                    <a:xfrm>
+                      <a:off x="0" y="0"/>
+                      <a:ext cx="5220335" cy="2899410"/>
+                    </a:xfrm>
+                    <a:prstGeom prst="rect">
+                      <a:avLst/>
+                    </a:prstGeom>
+                  </pic:spPr>
+                </pic:pic>
+              </a:graphicData>
+            </a:graphic>
+            <wp14:sizeRelH relativeFrom="margin">
+              <wp14:pctWidth>0</wp14:pctWidth>
+            </wp14:sizeRelH>
+            <wp14:sizeRelV relativeFrom="margin">
+              <wp14:pctHeight>0</wp14:pctHeight>
+            </wp14:sizeRelV>
+          </wp:anchor>
+        </w:drawing>
+      </w:r>
+      <w:r>
+        <w:rPr>
+          <w:i/>
+          <w:iCs/>
+          <w:sz w:val="28"/>
+          <w:szCs w:val="28"/>
+        </w:rPr>
+        <w:t>Page 12: KPIs &amp; Metrics.</w:t>
+      </w:r>
+    </w:p>
+    <w:p>
+      <w:pPr>
+        <w:rPr>
+          <w:rFonts w:asciiTheme="minorBidi" w:hAnsiTheme="minorBidi" w:cstheme="minorBidi"/>
+          <w:color w:val="F7F8FC"/>
+          <w:sz w:val="28"/>
+          <w:szCs w:val="28"/>
+        </w:rPr>
+      </w:pPr>
+    </w:p>
+    <w:p>
+      <w:pPr>
+        <w:spacing w:after="160" w:line="259" w:lineRule="auto"/>
+      </w:pPr>
+      <w:r>
+        <w:br w:type="page"/>
+      </w:r>
+    </w:p>
+    <w:p>
+      <w:pPr>
+        <w:pStyle w:val="Heading1"/>
         <w:rPr>
           <w:b/>
           <w:bCs/>
         </w:rPr>
+      </w:pPr>
+      <w:bookmarkStart w:id="29" w:name="_Toc236995821"/>
+      <w:r>
+        <w:rPr>
+          <w:b/>
+          <w:bCs/>
+        </w:rPr>
+        <w:lastRenderedPageBreak/>
         <w:t>Conclusion</w:t>
       </w:r>
-      <w:bookmarkEnd w:id="28"/>
+      <w:bookmarkEnd w:id="29"/>
     </w:p>
     <w:p>
       <w:pPr>
@@ -9190,7 +10404,6 @@
           <w:sz w:val="28"/>
           <w:szCs w:val="28"/>
         </w:rPr>
-        <w:lastRenderedPageBreak/>
         <w:t xml:space="preserve">By addressing these issues and implementing the recommended actions, the pharmacy can improve both patient safety and operational efficiency. </w:t>
       </w:r>
     </w:p>
@@ -9297,7 +10510,7 @@
           <w:bdr w:val="single" w:sz="2" w:space="0" w:color="E3E3E3" w:frame="1"/>
         </w:rPr>
       </w:pPr>
-      <w:bookmarkStart w:id="29" w:name="_Toc235283887"/>
+      <w:bookmarkStart w:id="30" w:name="_Toc236995822"/>
       <w:r>
         <w:rPr>
           <w:b/>
@@ -9305,7 +10518,7 @@
         </w:rPr>
         <w:t>Word of Author: Thank you.</w:t>
       </w:r>
-      <w:bookmarkEnd w:id="29"/>
+      <w:bookmarkEnd w:id="30"/>
     </w:p>
     <w:sectPr>
       <w:pgSz w:w="12240" w:h="15840"/>

</xml_diff>